<commit_message>
Auto sync 2026-10-27 12:02:02
</commit_message>
<xml_diff>
--- a/04-需求管理/PRD-生产管理计划管理-开发交付版-V1.1-20261027.docx
+++ b/04-需求管理/PRD-生产管理计划管理-开发交付版-V1.1-20261027.docx
@@ -1299,6 +1299,9 @@
           </w:tcPr>
           <w:p>
             <w:r>
+              <w:rPr>
+                <w:sz w:val="19"/>
+              </w:rPr>
               <w:t>审核完整省区汇总；本级待审明细数量修订</w:t>
             </w:r>
           </w:p>
@@ -1394,6 +1397,9 @@
           </w:tcPr>
           <w:p>
             <w:r>
+              <w:rPr>
+                <w:sz w:val="19"/>
+              </w:rPr>
               <w:t>审核完整大区汇总；本级待审明细数量修订</w:t>
             </w:r>
           </w:p>
@@ -1488,6 +1494,9 @@
           </w:tcPr>
           <w:p>
             <w:r>
+              <w:rPr>
+                <w:sz w:val="19"/>
+              </w:rPr>
               <w:t>审核完整中心汇总；本级待审明细数量修订</w:t>
             </w:r>
           </w:p>
@@ -1583,6 +1592,9 @@
           </w:tcPr>
           <w:p>
             <w:r>
+              <w:rPr>
+                <w:sz w:val="19"/>
+              </w:rPr>
               <w:t>初审完整线上渠道商品计划；本级待审明细数量修订</w:t>
             </w:r>
           </w:p>
@@ -1677,6 +1689,9 @@
           </w:tcPr>
           <w:p>
             <w:r>
+              <w:rPr>
+                <w:sz w:val="19"/>
+              </w:rPr>
               <w:t>终审线上渠道计划；本级待审明细数量修订</w:t>
             </w:r>
           </w:p>
@@ -3591,6 +3606,9 @@
           </w:tcPr>
           <w:p>
             <w:r>
+              <w:rPr>
+                <w:sz w:val="19"/>
+              </w:rPr>
               <w:t>查看、本级待审数量修订及审核；首级未审时整批撤回</w:t>
             </w:r>
           </w:p>
@@ -20685,7 +20703,14 @@
         </w:trPr>
         <w:tc>
           <w:tcPr>
-            <w:tcW w:type="dxa" w:w="3360"/>
+            <w:tcW w:type="dxa" w:w="1800"/>
+            <w:vAlign w:val="center"/>
+            <w:tcMar>
+              <w:top w:w="85" w:type="dxa"/>
+              <w:bottom w:w="85" w:type="dxa"/>
+              <w:left w:w="85" w:type="dxa"/>
+              <w:right w:w="85" w:type="dxa"/>
+            </w:tcMar>
             <w:tcBorders>
               <w:top w:val="single" w:sz="4" w:color="D9D9D9"/>
               <w:bottom w:val="single" w:sz="4" w:color="D9D9D9"/>
@@ -20709,7 +20734,14 @@
         </w:tc>
         <w:tc>
           <w:tcPr>
-            <w:tcW w:type="dxa" w:w="3360"/>
+            <w:tcW w:type="dxa" w:w="3744"/>
+            <w:vAlign w:val="center"/>
+            <w:tcMar>
+              <w:top w:w="85" w:type="dxa"/>
+              <w:bottom w:w="85" w:type="dxa"/>
+              <w:left w:w="85" w:type="dxa"/>
+              <w:right w:w="85" w:type="dxa"/>
+            </w:tcMar>
             <w:tcBorders>
               <w:top w:val="single" w:sz="4" w:color="D9D9D9"/>
               <w:bottom w:val="single" w:sz="4" w:color="D9D9D9"/>
@@ -20733,7 +20765,14 @@
         </w:tc>
         <w:tc>
           <w:tcPr>
-            <w:tcW w:type="dxa" w:w="3360"/>
+            <w:tcW w:type="dxa" w:w="4536"/>
+            <w:vAlign w:val="center"/>
+            <w:tcMar>
+              <w:top w:w="85" w:type="dxa"/>
+              <w:bottom w:w="85" w:type="dxa"/>
+              <w:left w:w="85" w:type="dxa"/>
+              <w:right w:w="85" w:type="dxa"/>
+            </w:tcMar>
             <w:tcBorders>
               <w:top w:val="single" w:sz="4" w:color="D9D9D9"/>
               <w:bottom w:val="single" w:sz="4" w:color="D9D9D9"/>
@@ -20760,6 +20799,13 @@
         <w:tc>
           <w:tcPr>
             <w:tcW w:type="dxa" w:w="1800"/>
+            <w:vAlign w:val="center"/>
+            <w:tcMar>
+              <w:top w:w="85" w:type="dxa"/>
+              <w:bottom w:w="85" w:type="dxa"/>
+              <w:left w:w="85" w:type="dxa"/>
+              <w:right w:w="85" w:type="dxa"/>
+            </w:tcMar>
             <w:tcBorders>
               <w:top w:val="single" w:sz="4" w:color="D9D9D9"/>
               <w:bottom w:val="single" w:sz="4" w:color="D9D9D9"/>
@@ -20783,6 +20829,13 @@
         <w:tc>
           <w:tcPr>
             <w:tcW w:type="dxa" w:w="3744"/>
+            <w:vAlign w:val="center"/>
+            <w:tcMar>
+              <w:top w:w="85" w:type="dxa"/>
+              <w:bottom w:w="85" w:type="dxa"/>
+              <w:left w:w="85" w:type="dxa"/>
+              <w:right w:w="85" w:type="dxa"/>
+            </w:tcMar>
             <w:tcBorders>
               <w:top w:val="single" w:sz="4" w:color="D9D9D9"/>
               <w:bottom w:val="single" w:sz="4" w:color="D9D9D9"/>
@@ -20806,6 +20859,13 @@
         <w:tc>
           <w:tcPr>
             <w:tcW w:type="dxa" w:w="4536"/>
+            <w:vAlign w:val="center"/>
+            <w:tcMar>
+              <w:top w:w="85" w:type="dxa"/>
+              <w:bottom w:w="85" w:type="dxa"/>
+              <w:left w:w="85" w:type="dxa"/>
+              <w:right w:w="85" w:type="dxa"/>
+            </w:tcMar>
             <w:tcBorders>
               <w:top w:val="single" w:sz="4" w:color="D9D9D9"/>
               <w:bottom w:val="single" w:sz="4" w:color="D9D9D9"/>
@@ -20831,6 +20891,13 @@
         <w:tc>
           <w:tcPr>
             <w:tcW w:type="dxa" w:w="1800"/>
+            <w:vAlign w:val="center"/>
+            <w:tcMar>
+              <w:top w:w="85" w:type="dxa"/>
+              <w:bottom w:w="85" w:type="dxa"/>
+              <w:left w:w="85" w:type="dxa"/>
+              <w:right w:w="85" w:type="dxa"/>
+            </w:tcMar>
             <w:tcBorders>
               <w:top w:val="single" w:sz="4" w:color="D9D9D9"/>
               <w:bottom w:val="single" w:sz="4" w:color="D9D9D9"/>
@@ -20854,6 +20921,13 @@
         <w:tc>
           <w:tcPr>
             <w:tcW w:type="dxa" w:w="3744"/>
+            <w:vAlign w:val="center"/>
+            <w:tcMar>
+              <w:top w:w="85" w:type="dxa"/>
+              <w:bottom w:w="85" w:type="dxa"/>
+              <w:left w:w="85" w:type="dxa"/>
+              <w:right w:w="85" w:type="dxa"/>
+            </w:tcMar>
             <w:tcBorders>
               <w:top w:val="single" w:sz="4" w:color="D9D9D9"/>
               <w:bottom w:val="single" w:sz="4" w:color="D9D9D9"/>
@@ -20877,6 +20951,13 @@
         <w:tc>
           <w:tcPr>
             <w:tcW w:type="dxa" w:w="4536"/>
+            <w:vAlign w:val="center"/>
+            <w:tcMar>
+              <w:top w:w="85" w:type="dxa"/>
+              <w:bottom w:w="85" w:type="dxa"/>
+              <w:left w:w="85" w:type="dxa"/>
+              <w:right w:w="85" w:type="dxa"/>
+            </w:tcMar>
             <w:tcBorders>
               <w:top w:val="single" w:sz="4" w:color="D9D9D9"/>
               <w:bottom w:val="single" w:sz="4" w:color="D9D9D9"/>
@@ -20902,6 +20983,13 @@
         <w:tc>
           <w:tcPr>
             <w:tcW w:type="dxa" w:w="1800"/>
+            <w:vAlign w:val="center"/>
+            <w:tcMar>
+              <w:top w:w="85" w:type="dxa"/>
+              <w:bottom w:w="85" w:type="dxa"/>
+              <w:left w:w="85" w:type="dxa"/>
+              <w:right w:w="85" w:type="dxa"/>
+            </w:tcMar>
             <w:tcBorders>
               <w:top w:val="single" w:sz="4" w:color="D9D9D9"/>
               <w:bottom w:val="single" w:sz="4" w:color="D9D9D9"/>
@@ -20925,6 +21013,13 @@
         <w:tc>
           <w:tcPr>
             <w:tcW w:type="dxa" w:w="3744"/>
+            <w:vAlign w:val="center"/>
+            <w:tcMar>
+              <w:top w:w="85" w:type="dxa"/>
+              <w:bottom w:w="85" w:type="dxa"/>
+              <w:left w:w="85" w:type="dxa"/>
+              <w:right w:w="85" w:type="dxa"/>
+            </w:tcMar>
             <w:tcBorders>
               <w:top w:val="single" w:sz="4" w:color="D9D9D9"/>
               <w:bottom w:val="single" w:sz="4" w:color="D9D9D9"/>
@@ -20948,6 +21043,13 @@
         <w:tc>
           <w:tcPr>
             <w:tcW w:type="dxa" w:w="4536"/>
+            <w:vAlign w:val="center"/>
+            <w:tcMar>
+              <w:top w:w="85" w:type="dxa"/>
+              <w:bottom w:w="85" w:type="dxa"/>
+              <w:left w:w="85" w:type="dxa"/>
+              <w:right w:w="85" w:type="dxa"/>
+            </w:tcMar>
             <w:tcBorders>
               <w:top w:val="single" w:sz="4" w:color="D9D9D9"/>
               <w:bottom w:val="single" w:sz="4" w:color="D9D9D9"/>
@@ -20973,6 +21075,13 @@
         <w:tc>
           <w:tcPr>
             <w:tcW w:type="dxa" w:w="1800"/>
+            <w:vAlign w:val="center"/>
+            <w:tcMar>
+              <w:top w:w="85" w:type="dxa"/>
+              <w:bottom w:w="85" w:type="dxa"/>
+              <w:left w:w="85" w:type="dxa"/>
+              <w:right w:w="85" w:type="dxa"/>
+            </w:tcMar>
             <w:tcBorders>
               <w:top w:val="single" w:sz="4" w:color="D9D9D9"/>
               <w:bottom w:val="single" w:sz="4" w:color="D9D9D9"/>
@@ -20996,6 +21105,13 @@
         <w:tc>
           <w:tcPr>
             <w:tcW w:type="dxa" w:w="3744"/>
+            <w:vAlign w:val="center"/>
+            <w:tcMar>
+              <w:top w:w="85" w:type="dxa"/>
+              <w:bottom w:w="85" w:type="dxa"/>
+              <w:left w:w="85" w:type="dxa"/>
+              <w:right w:w="85" w:type="dxa"/>
+            </w:tcMar>
             <w:tcBorders>
               <w:top w:val="single" w:sz="4" w:color="D9D9D9"/>
               <w:bottom w:val="single" w:sz="4" w:color="D9D9D9"/>
@@ -21019,6 +21135,13 @@
         <w:tc>
           <w:tcPr>
             <w:tcW w:type="dxa" w:w="4536"/>
+            <w:vAlign w:val="center"/>
+            <w:tcMar>
+              <w:top w:w="85" w:type="dxa"/>
+              <w:bottom w:w="85" w:type="dxa"/>
+              <w:left w:w="85" w:type="dxa"/>
+              <w:right w:w="85" w:type="dxa"/>
+            </w:tcMar>
             <w:tcBorders>
               <w:top w:val="single" w:sz="4" w:color="D9D9D9"/>
               <w:bottom w:val="single" w:sz="4" w:color="D9D9D9"/>
@@ -21044,6 +21167,13 @@
         <w:tc>
           <w:tcPr>
             <w:tcW w:type="dxa" w:w="1800"/>
+            <w:vAlign w:val="center"/>
+            <w:tcMar>
+              <w:top w:w="85" w:type="dxa"/>
+              <w:bottom w:w="85" w:type="dxa"/>
+              <w:left w:w="85" w:type="dxa"/>
+              <w:right w:w="85" w:type="dxa"/>
+            </w:tcMar>
             <w:tcBorders>
               <w:top w:val="single" w:sz="4" w:color="D9D9D9"/>
               <w:bottom w:val="single" w:sz="4" w:color="D9D9D9"/>
@@ -21067,6 +21197,13 @@
         <w:tc>
           <w:tcPr>
             <w:tcW w:type="dxa" w:w="3744"/>
+            <w:vAlign w:val="center"/>
+            <w:tcMar>
+              <w:top w:w="85" w:type="dxa"/>
+              <w:bottom w:w="85" w:type="dxa"/>
+              <w:left w:w="85" w:type="dxa"/>
+              <w:right w:w="85" w:type="dxa"/>
+            </w:tcMar>
             <w:tcBorders>
               <w:top w:val="single" w:sz="4" w:color="D9D9D9"/>
               <w:bottom w:val="single" w:sz="4" w:color="D9D9D9"/>
@@ -21090,6 +21227,13 @@
         <w:tc>
           <w:tcPr>
             <w:tcW w:type="dxa" w:w="4536"/>
+            <w:vAlign w:val="center"/>
+            <w:tcMar>
+              <w:top w:w="85" w:type="dxa"/>
+              <w:bottom w:w="85" w:type="dxa"/>
+              <w:left w:w="85" w:type="dxa"/>
+              <w:right w:w="85" w:type="dxa"/>
+            </w:tcMar>
             <w:tcBorders>
               <w:top w:val="single" w:sz="4" w:color="D9D9D9"/>
               <w:bottom w:val="single" w:sz="4" w:color="D9D9D9"/>
@@ -21115,6 +21259,13 @@
         <w:tc>
           <w:tcPr>
             <w:tcW w:type="dxa" w:w="1800"/>
+            <w:vAlign w:val="center"/>
+            <w:tcMar>
+              <w:top w:w="85" w:type="dxa"/>
+              <w:bottom w:w="85" w:type="dxa"/>
+              <w:left w:w="85" w:type="dxa"/>
+              <w:right w:w="85" w:type="dxa"/>
+            </w:tcMar>
             <w:tcBorders>
               <w:top w:val="single" w:sz="4" w:color="D9D9D9"/>
               <w:bottom w:val="single" w:sz="4" w:color="D9D9D9"/>
@@ -21138,6 +21289,13 @@
         <w:tc>
           <w:tcPr>
             <w:tcW w:type="dxa" w:w="3744"/>
+            <w:vAlign w:val="center"/>
+            <w:tcMar>
+              <w:top w:w="85" w:type="dxa"/>
+              <w:bottom w:w="85" w:type="dxa"/>
+              <w:left w:w="85" w:type="dxa"/>
+              <w:right w:w="85" w:type="dxa"/>
+            </w:tcMar>
             <w:tcBorders>
               <w:top w:val="single" w:sz="4" w:color="D9D9D9"/>
               <w:bottom w:val="single" w:sz="4" w:color="D9D9D9"/>
@@ -21161,6 +21319,13 @@
         <w:tc>
           <w:tcPr>
             <w:tcW w:type="dxa" w:w="4536"/>
+            <w:vAlign w:val="center"/>
+            <w:tcMar>
+              <w:top w:w="85" w:type="dxa"/>
+              <w:bottom w:w="85" w:type="dxa"/>
+              <w:left w:w="85" w:type="dxa"/>
+              <w:right w:w="85" w:type="dxa"/>
+            </w:tcMar>
             <w:tcBorders>
               <w:top w:val="single" w:sz="4" w:color="D9D9D9"/>
               <w:bottom w:val="single" w:sz="4" w:color="D9D9D9"/>
@@ -21186,6 +21351,13 @@
         <w:tc>
           <w:tcPr>
             <w:tcW w:type="dxa" w:w="1800"/>
+            <w:vAlign w:val="center"/>
+            <w:tcMar>
+              <w:top w:w="85" w:type="dxa"/>
+              <w:bottom w:w="85" w:type="dxa"/>
+              <w:left w:w="85" w:type="dxa"/>
+              <w:right w:w="85" w:type="dxa"/>
+            </w:tcMar>
             <w:tcBorders>
               <w:top w:val="single" w:sz="4" w:color="D9D9D9"/>
               <w:bottom w:val="single" w:sz="4" w:color="D9D9D9"/>
@@ -21209,6 +21381,13 @@
         <w:tc>
           <w:tcPr>
             <w:tcW w:type="dxa" w:w="3744"/>
+            <w:vAlign w:val="center"/>
+            <w:tcMar>
+              <w:top w:w="85" w:type="dxa"/>
+              <w:bottom w:w="85" w:type="dxa"/>
+              <w:left w:w="85" w:type="dxa"/>
+              <w:right w:w="85" w:type="dxa"/>
+            </w:tcMar>
             <w:tcBorders>
               <w:top w:val="single" w:sz="4" w:color="D9D9D9"/>
               <w:bottom w:val="single" w:sz="4" w:color="D9D9D9"/>
@@ -21232,6 +21411,13 @@
         <w:tc>
           <w:tcPr>
             <w:tcW w:type="dxa" w:w="4536"/>
+            <w:vAlign w:val="center"/>
+            <w:tcMar>
+              <w:top w:w="85" w:type="dxa"/>
+              <w:bottom w:w="85" w:type="dxa"/>
+              <w:left w:w="85" w:type="dxa"/>
+              <w:right w:w="85" w:type="dxa"/>
+            </w:tcMar>
             <w:tcBorders>
               <w:top w:val="single" w:sz="4" w:color="D9D9D9"/>
               <w:bottom w:val="single" w:sz="4" w:color="D9D9D9"/>
@@ -21257,6 +21443,13 @@
         <w:tc>
           <w:tcPr>
             <w:tcW w:type="dxa" w:w="1800"/>
+            <w:vAlign w:val="center"/>
+            <w:tcMar>
+              <w:top w:w="85" w:type="dxa"/>
+              <w:bottom w:w="85" w:type="dxa"/>
+              <w:left w:w="85" w:type="dxa"/>
+              <w:right w:w="85" w:type="dxa"/>
+            </w:tcMar>
             <w:tcBorders>
               <w:top w:val="single" w:sz="4" w:color="D9D9D9"/>
               <w:bottom w:val="single" w:sz="4" w:color="D9D9D9"/>
@@ -21280,6 +21473,13 @@
         <w:tc>
           <w:tcPr>
             <w:tcW w:type="dxa" w:w="3744"/>
+            <w:vAlign w:val="center"/>
+            <w:tcMar>
+              <w:top w:w="85" w:type="dxa"/>
+              <w:bottom w:w="85" w:type="dxa"/>
+              <w:left w:w="85" w:type="dxa"/>
+              <w:right w:w="85" w:type="dxa"/>
+            </w:tcMar>
             <w:tcBorders>
               <w:top w:val="single" w:sz="4" w:color="D9D9D9"/>
               <w:bottom w:val="single" w:sz="4" w:color="D9D9D9"/>
@@ -21303,6 +21503,13 @@
         <w:tc>
           <w:tcPr>
             <w:tcW w:type="dxa" w:w="4536"/>
+            <w:vAlign w:val="center"/>
+            <w:tcMar>
+              <w:top w:w="85" w:type="dxa"/>
+              <w:bottom w:w="85" w:type="dxa"/>
+              <w:left w:w="85" w:type="dxa"/>
+              <w:right w:w="85" w:type="dxa"/>
+            </w:tcMar>
             <w:tcBorders>
               <w:top w:val="single" w:sz="4" w:color="D9D9D9"/>
               <w:bottom w:val="single" w:sz="4" w:color="D9D9D9"/>
@@ -21328,6 +21535,13 @@
         <w:tc>
           <w:tcPr>
             <w:tcW w:type="dxa" w:w="1800"/>
+            <w:vAlign w:val="center"/>
+            <w:tcMar>
+              <w:top w:w="85" w:type="dxa"/>
+              <w:bottom w:w="85" w:type="dxa"/>
+              <w:left w:w="85" w:type="dxa"/>
+              <w:right w:w="85" w:type="dxa"/>
+            </w:tcMar>
             <w:tcBorders>
               <w:top w:val="single" w:sz="4" w:color="D9D9D9"/>
               <w:bottom w:val="single" w:sz="4" w:color="D9D9D9"/>
@@ -21351,6 +21565,13 @@
         <w:tc>
           <w:tcPr>
             <w:tcW w:type="dxa" w:w="3744"/>
+            <w:vAlign w:val="center"/>
+            <w:tcMar>
+              <w:top w:w="85" w:type="dxa"/>
+              <w:bottom w:w="85" w:type="dxa"/>
+              <w:left w:w="85" w:type="dxa"/>
+              <w:right w:w="85" w:type="dxa"/>
+            </w:tcMar>
             <w:tcBorders>
               <w:top w:val="single" w:sz="4" w:color="D9D9D9"/>
               <w:bottom w:val="single" w:sz="4" w:color="D9D9D9"/>
@@ -21374,6 +21595,13 @@
         <w:tc>
           <w:tcPr>
             <w:tcW w:type="dxa" w:w="4536"/>
+            <w:vAlign w:val="center"/>
+            <w:tcMar>
+              <w:top w:w="85" w:type="dxa"/>
+              <w:bottom w:w="85" w:type="dxa"/>
+              <w:left w:w="85" w:type="dxa"/>
+              <w:right w:w="85" w:type="dxa"/>
+            </w:tcMar>
             <w:tcBorders>
               <w:top w:val="single" w:sz="4" w:color="D9D9D9"/>
               <w:bottom w:val="single" w:sz="4" w:color="D9D9D9"/>

</xml_diff>